<commit_message>
feat: implement core application logic, AI backend services, and styling for PWA
</commit_message>
<xml_diff>
--- a/NutriVision_AI_PRD_1.docx
+++ b/NutriVision_AI_PRD_1.docx
@@ -3316,7 +3316,7 @@
           <w:color w:val="1F6FEB"/>
           <w:sz w:val="24"/>
         </w:rPr>
-        <w:t>7.11 Live AI Model Tester Modal (Uji Langsung Model AI di Bilah Atas)</w:t>
+        <w:t>7.11 Halaman Khusus Evaluasi Kelayakan Menu Pasien (AI Model Teks)</w:t>
       </w:r>
     </w:p>
     <w:p>
@@ -3332,7 +3332,7 @@
           <w:color w:val="222222"/>
           <w:sz w:val="21"/>
         </w:rPr>
-        <w:t>Tersedia modal pengujian interaktif (ai-tester-modal) yang dapat diakses langsung dari tombol "Uji AI Model" di bilah atas aplikasi. Pengguna atau dewan juri dapat mengetikkan teks nama hidangan atau resep makanan apa pun secara live untuk menguji inferensi model DistilBERT Multilingual Safetensors. Modal ini menampilkan: • Badge Intent Terdeteksi: Menampilkan hasil klasifikasi dari intent_map.json (Meal Plan, Nutrisi, atau Workout); • Skor Keamanan &amp; Keyakinan (Confidence Score %): Evaluasi kepatuhan klinis; • Catatan Peringatan Konflik Alergi Pasien: Deteksi otomatis bahan yang bertentangan dengan profil medis pengguna; • Pengukur Latensi Real-Time: Waktu eksekusi inferensi ultra-cepat (&lt;15 milidetik) berkat optimasi tokenizer.json lokal dan komputasi NumPy.</w:t>
+        <w:t>Tersedia halaman khusus yang didedikasikan untuk evaluasi klinis resep dan menu makanan pasien pasca-bedah, yang dapat diakses langsung secara eksklusif dari tombol navigasi "AI Model Teks" di bilah atas aplikasi (tanpa masuk ke menu sidebar reguler pasien guna menjaga kerapian alur kerja klinis). Halaman ini dilengkapi tombol kembali ('Kembali ke Dashboard') untuk kembali secara instan ke tampilan ikhtisar utama. Fitur pada halaman ini mencakup: 1) Status AI Klinis Real-Time: Menampilkan indikator latensi ultra-cepat (&lt;18 milidetik) dan status operasional model Safetensors; 2) Panel Masukan Menu Pasien: Memuat 6 contoh menu cepat (Bakso Sapi Kuah, Sup Ikan Gabus, Bening Bayam Jagung, Bubur Salmon, Rendang Pedas, Ayam Goreng Tepung), area teks resep, penghitung karakter dinamis, dan penanda konteks medis; 3) Kata Kunci yang Dianalisis: Chip deteksi otomatis bahan utama pangan yang paling memengaruhi keamanan pasien; 4) Hasil Evaluasi Klinis: Triage keselamatan 3 tingkat (Aman Sangat Direkomendasikan, Netral, Peringatan Pantangan), bar tingkat keyakinan (Confidence %), dan validasi protokol bedah ESPEN; 5) Catatan Evaluasi Gizi: Tiga butir rekomendasi klinis terperinci mengenai daya cerna lambung, perbaikan jaringan luka, dan pemeriksaan alergen; 6) Estimasi Nutrisi Per Porsi: Empat kartu metrik gizi standar TKPI Kemenkes (Protein &amp; Albumin dalam gram, Total Kalori Energi Basal, Seng/Zinc untuk sintesis jaringan, dan Natrium/Garam); 7) Banner Persetujuan Menu: Tombol aksi langsung 'Kirim ke Dapur Gizi Pasien' yang terhubung dengan rekam medis elektronik rumah sakit.</w:t>
       </w:r>
     </w:p>
     <w:p>
@@ -6111,7 +6111,7 @@
                 <w:color w:val="222222"/>
                 <w:sz w:val="19"/>
               </w:rPr>
-              <w:t>Uji Model AI</w:t>
+              <w:t>AI Model Teks</w:t>
             </w:r>
           </w:p>
         </w:tc>
@@ -6137,7 +6137,7 @@
                 <w:color w:val="222222"/>
                 <w:sz w:val="19"/>
               </w:rPr>
-              <w:t>Menyediakan modal tester interaktif di navbar untuk pengujian langsung inferensi DistilBERT Safetensors, intent_map, dan latensi.</w:t>
+              <w:t>Menyediakan halaman khusus 'Evaluasi Kelayakan Menu Pasien' yang diakses via tombol 'AI Model Teks' di navbar (dengan tombol kembali ke dashboard), memuat 6 preset resep, ekstraksi kata kunci, triage klinis, bar keyakinan, estimasi nutrisi per porsi, dan integrasi dapur gizi.</w:t>
             </w:r>
           </w:p>
         </w:tc>

</xml_diff>